<commit_message>
Commit  para que el word refleje la base de datos
</commit_message>
<xml_diff>
--- a/Sigma-Aqua.docx
+++ b/Sigma-Aqua.docx
@@ -1593,154 +1593,154 @@
         <w:rPr>
           <w:rtl w:val="0"/>
         </w:rPr>
-        <w:t xml:space="preserve">1.- Empresa: id_empresa, nombre, rut (UNIQUE), dirección, teléfono, correo.</w:t>
-      </w:r>
-    </w:p>
-    <w:p>
-      <w:pPr>
-        <w:rPr/>
-      </w:pPr>
-      <w:r>
-        <w:rPr>
-          <w:rtl w:val="0"/>
-        </w:rPr>
-      </w:r>
-    </w:p>
-    <w:p>
-      <w:pPr>
-        <w:rPr/>
-      </w:pPr>
-      <w:r>
-        <w:rPr>
-          <w:rtl w:val="0"/>
-        </w:rPr>
-        <w:t xml:space="preserve">2.- Usuario: id_usuario, correo (UNIQUE), password_hash, estado, FK: id_rol, FK: id_trabajador (nullable), FK: id_veterinario (nullable), FK: id_proveedor (nullable).</w:t>
-      </w:r>
-    </w:p>
-    <w:p>
-      <w:pPr>
-        <w:rPr/>
-      </w:pPr>
-      <w:r>
-        <w:rPr>
-          <w:rtl w:val="0"/>
-        </w:rPr>
-      </w:r>
-    </w:p>
-    <w:p>
-      <w:pPr>
-        <w:rPr/>
-      </w:pPr>
-      <w:r>
-        <w:rPr>
-          <w:rtl w:val="0"/>
-        </w:rPr>
-        <w:t xml:space="preserve">3.- Rol: id_rol, nombre_rol, descripcion.</w:t>
-      </w:r>
-    </w:p>
-    <w:p>
-      <w:pPr>
-        <w:rPr/>
-      </w:pPr>
-      <w:r>
-        <w:rPr>
-          <w:rtl w:val="0"/>
-        </w:rPr>
-      </w:r>
-    </w:p>
-    <w:p>
-      <w:pPr>
-        <w:rPr/>
-      </w:pPr>
-      <w:r>
-        <w:rPr>
-          <w:rtl w:val="0"/>
-        </w:rPr>
-        <w:t xml:space="preserve">4.- Permiso: id_permiso, nombre_permiso, descripcion.</w:t>
-      </w:r>
-    </w:p>
-    <w:p>
-      <w:pPr>
-        <w:rPr/>
-      </w:pPr>
-      <w:r>
-        <w:rPr>
-          <w:rtl w:val="0"/>
-        </w:rPr>
-      </w:r>
-    </w:p>
-    <w:p>
-      <w:pPr>
-        <w:rPr/>
-      </w:pPr>
-      <w:r>
-        <w:rPr>
-          <w:rtl w:val="0"/>
-        </w:rPr>
-        <w:t xml:space="preserve">5.- Rol_Permiso: FK: id_rol, FK: id_permiso.</w:t>
-      </w:r>
-    </w:p>
-    <w:p>
-      <w:pPr>
-        <w:rPr/>
-      </w:pPr>
-      <w:r>
-        <w:rPr>
-          <w:rtl w:val="0"/>
-        </w:rPr>
-      </w:r>
-    </w:p>
-    <w:p>
-      <w:pPr>
-        <w:rPr/>
-      </w:pPr>
-      <w:r>
-        <w:rPr>
-          <w:rtl w:val="0"/>
-        </w:rPr>
-        <w:t xml:space="preserve">6.- Zona Sanitaria: id_zona, codigo_oficial (UNIQUE), nombre_zona, region, provincia, estado (productivo, descanso sanitario, cuarentena).</w:t>
-      </w:r>
-    </w:p>
-    <w:p>
-      <w:pPr>
-        <w:rPr/>
-      </w:pPr>
-      <w:r>
-        <w:rPr>
-          <w:rtl w:val="0"/>
-        </w:rPr>
-      </w:r>
-    </w:p>
-    <w:p>
-      <w:pPr>
-        <w:rPr/>
-      </w:pPr>
-      <w:r>
-        <w:rPr>
-          <w:rtl w:val="0"/>
-        </w:rPr>
-        <w:t xml:space="preserve">7.- Centro de cultivo: id_centro, nombre, ubicación, volumen_centro_m3, densidad_maxima_kg_m3 (ambos para calcular biomasa), capacidad_max, tipo_agua, profundidad, fecha_inicio, codigo_permiso_concesion, estado, FK: id_empresa, FK: id_zona.</w:t>
-      </w:r>
-    </w:p>
-    <w:p>
-      <w:pPr>
-        <w:rPr/>
-      </w:pPr>
-      <w:r>
-        <w:rPr>
-          <w:rtl w:val="0"/>
-        </w:rPr>
-      </w:r>
-    </w:p>
-    <w:p>
-      <w:pPr>
-        <w:rPr/>
-      </w:pPr>
-      <w:r>
-        <w:rPr>
-          <w:rtl w:val="0"/>
-        </w:rPr>
-        <w:t xml:space="preserve">8.- Especie: id_especie, nombre_común, nombre_científico.</w:t>
+        <w:t>1.- EMPRESA: ID_EMPRESA (PK), NOMBRE_EMPRESA, RUT_EMPRESA (UNIQUE), DIRECCION_EMPRESA, TELEFONO_EMPRESA, EMAIL_EMPRESA.</w:t>
+      </w:r>
+    </w:p>
+    <w:p>
+      <w:pPr>
+        <w:rPr/>
+      </w:pPr>
+      <w:r>
+        <w:rPr>
+          <w:rtl w:val="0"/>
+        </w:rPr>
+      </w:r>
+    </w:p>
+    <w:p>
+      <w:pPr>
+        <w:rPr/>
+      </w:pPr>
+      <w:r>
+        <w:rPr>
+          <w:rtl w:val="0"/>
+        </w:rPr>
+        <w:t>2.- USUARIO: ID_USUARIO (PK), EMAIL_USU (UNIQUE), PASSWORD_HASH_USU, ESTADO_USU, FK: ID_ROL, FK: ID_TRABAJADOR (nullable), FK: ID_VETERINARIO (nullable), FK: ID_PROVEEDOR (nullable).</w:t>
+      </w:r>
+    </w:p>
+    <w:p>
+      <w:pPr>
+        <w:rPr/>
+      </w:pPr>
+      <w:r>
+        <w:rPr>
+          <w:rtl w:val="0"/>
+        </w:rPr>
+      </w:r>
+    </w:p>
+    <w:p>
+      <w:pPr>
+        <w:rPr/>
+      </w:pPr>
+      <w:r>
+        <w:rPr>
+          <w:rtl w:val="0"/>
+        </w:rPr>
+        <w:t>3.- ROL: ID_ROL (PK), NOMBRE_ROL, DESCRIPCION_ROL.</w:t>
+      </w:r>
+    </w:p>
+    <w:p>
+      <w:pPr>
+        <w:rPr/>
+      </w:pPr>
+      <w:r>
+        <w:rPr>
+          <w:rtl w:val="0"/>
+        </w:rPr>
+      </w:r>
+    </w:p>
+    <w:p>
+      <w:pPr>
+        <w:rPr/>
+      </w:pPr>
+      <w:r>
+        <w:rPr>
+          <w:rtl w:val="0"/>
+        </w:rPr>
+        <w:t>4.- PERMISO: ID_PERMISO (PK), NOMBRE_PERMISO, DESCRIPCION_PERMISO.</w:t>
+      </w:r>
+    </w:p>
+    <w:p>
+      <w:pPr>
+        <w:rPr/>
+      </w:pPr>
+      <w:r>
+        <w:rPr>
+          <w:rtl w:val="0"/>
+        </w:rPr>
+      </w:r>
+    </w:p>
+    <w:p>
+      <w:pPr>
+        <w:rPr/>
+      </w:pPr>
+      <w:r>
+        <w:rPr>
+          <w:rtl w:val="0"/>
+        </w:rPr>
+        <w:t>5.- ROL_PERMISO: FK: ID_ROL, FK: ID_PERMISO (PK compuesta).</w:t>
+      </w:r>
+    </w:p>
+    <w:p>
+      <w:pPr>
+        <w:rPr/>
+      </w:pPr>
+      <w:r>
+        <w:rPr>
+          <w:rtl w:val="0"/>
+        </w:rPr>
+      </w:r>
+    </w:p>
+    <w:p>
+      <w:pPr>
+        <w:rPr/>
+      </w:pPr>
+      <w:r>
+        <w:rPr>
+          <w:rtl w:val="0"/>
+        </w:rPr>
+        <w:t>6.- ZONA_SANITARIA: ID_ZONA (PK), CODIGO_OFICIAL_ZONA (UNIQUE), NOMBRE_ZONA, REGION_ZONA, PROVINCIA_ZONA, ESTADO_ZONA (productivo, descanso sanitario, cuarentena).</w:t>
+      </w:r>
+    </w:p>
+    <w:p>
+      <w:pPr>
+        <w:rPr/>
+      </w:pPr>
+      <w:r>
+        <w:rPr>
+          <w:rtl w:val="0"/>
+        </w:rPr>
+      </w:r>
+    </w:p>
+    <w:p>
+      <w:pPr>
+        <w:rPr/>
+      </w:pPr>
+      <w:r>
+        <w:rPr>
+          <w:rtl w:val="0"/>
+        </w:rPr>
+        <w:t>7.- CENTRO_CULTIVO: ID_CENTRO (PK), NOMBRE_CENTRO, UBICACION_CENTRO, VOLUMEN_CENTRO_M3, DENSIDAD_MAXIMA_KG_M3 (ambos para calcular biomasa), CAPACIDAD_MAX_CENTRO, TIPO_AGUA_CENTRO, PROFUNDIDAD_CENTRO, FECHA_INICIO_CENTRO, CODIGO_PERMISO_CONCESION_CENTRO, ESTADO_CENTRO, FK: ID_EMPRESA, FK: ID_ZONA.</w:t>
+      </w:r>
+    </w:p>
+    <w:p>
+      <w:pPr>
+        <w:rPr/>
+      </w:pPr>
+      <w:r>
+        <w:rPr>
+          <w:rtl w:val="0"/>
+        </w:rPr>
+      </w:r>
+    </w:p>
+    <w:p>
+      <w:pPr>
+        <w:rPr/>
+      </w:pPr>
+      <w:r>
+        <w:rPr>
+          <w:rtl w:val="0"/>
+        </w:rPr>
+        <w:t>8.- ESPECIE: ID_ESPECIE (PK), NOMBRE_COMUN_ESPECIE, NOMBRE_CIENTIFICO_ESPECIE.</w:t>
       </w:r>
     </w:p>
     <w:p>
@@ -1762,449 +1762,449 @@
           <w:rFonts w:ascii="Arial Unicode MS" w:cs="Arial Unicode MS" w:eastAsia="Arial Unicode MS" w:hAnsi="Arial Unicode MS"/>
           <w:rtl w:val="0"/>
         </w:rPr>
-        <w:t xml:space="preserve">9.- Lote: id_lote, FK: id_centro, FK: id_especie, fecha_ingreso, cantidad_inicial, cantidad_actual (calculada: inicial − mortalidad ± traslados − cosechas), estado.</w:t>
-      </w:r>
-    </w:p>
-    <w:p>
-      <w:pPr>
-        <w:rPr/>
-      </w:pPr>
-      <w:r>
-        <w:rPr>
-          <w:rtl w:val="0"/>
-        </w:rPr>
-        <w:t xml:space="preserve">10.- Muestreo / Biometría: id_muestreo, FK: id_lote, fecha, peso_promedio, cantidad_muestra, FK: id_trabajador (responsable).</w:t>
-      </w:r>
-    </w:p>
-    <w:p>
-      <w:pPr>
-        <w:rPr/>
-      </w:pPr>
-      <w:r>
-        <w:rPr>
-          <w:rtl w:val="0"/>
-        </w:rPr>
-      </w:r>
-    </w:p>
-    <w:p>
-      <w:pPr>
-        <w:rPr/>
-      </w:pPr>
-      <w:r>
-        <w:rPr>
-          <w:rtl w:val="0"/>
-        </w:rPr>
-        <w:t xml:space="preserve">11.- Alimentación: id_alimentacion, FK: id_lote, fecha, cantidad_alimento, FK: id_tipo_alimento, FK: id_trabajador (trabajador responsable).</w:t>
-      </w:r>
-    </w:p>
-    <w:p>
-      <w:pPr>
-        <w:rPr/>
-      </w:pPr>
-      <w:r>
-        <w:rPr>
-          <w:rtl w:val="0"/>
-        </w:rPr>
-      </w:r>
-    </w:p>
-    <w:p>
-      <w:pPr>
-        <w:rPr/>
-      </w:pPr>
-      <w:r>
-        <w:rPr>
-          <w:rtl w:val="0"/>
-        </w:rPr>
-        <w:t xml:space="preserve">12.- Tipo_Alimento: id_tipo_alimento, nombre, descripcion.</w:t>
-      </w:r>
-    </w:p>
-    <w:p>
-      <w:pPr>
-        <w:rPr/>
-      </w:pPr>
-      <w:r>
-        <w:rPr>
-          <w:rtl w:val="0"/>
-        </w:rPr>
-      </w:r>
-    </w:p>
-    <w:p>
-      <w:pPr>
-        <w:rPr/>
-      </w:pPr>
-      <w:r>
-        <w:rPr>
-          <w:rtl w:val="0"/>
-        </w:rPr>
-        <w:t xml:space="preserve">13.- Mortalidad: id_mortalidad, FK: id_lote, fecha, cantidad, FK: id_causa_mortalidad, observaciones, FK: id_trabajador (quien registra).</w:t>
-      </w:r>
-    </w:p>
-    <w:p>
-      <w:pPr>
-        <w:rPr/>
-      </w:pPr>
-      <w:r>
-        <w:rPr>
-          <w:rtl w:val="0"/>
-        </w:rPr>
-      </w:r>
-    </w:p>
-    <w:p>
-      <w:pPr>
-        <w:rPr/>
-      </w:pPr>
-      <w:r>
-        <w:rPr>
-          <w:rtl w:val="0"/>
-        </w:rPr>
-        <w:t xml:space="preserve">14.- Causa_Mortalidad: id_causa, nombre_causa, descripcion.</w:t>
-      </w:r>
-    </w:p>
-    <w:p>
-      <w:pPr>
-        <w:rPr/>
-      </w:pPr>
-      <w:r>
-        <w:rPr>
-          <w:rtl w:val="0"/>
-        </w:rPr>
-      </w:r>
-    </w:p>
-    <w:p>
-      <w:pPr>
-        <w:rPr/>
-      </w:pPr>
-      <w:r>
-        <w:rPr>
-          <w:rtl w:val="0"/>
-        </w:rPr>
-        <w:t xml:space="preserve">15.- Registro sanitario: id_registro, FK: id_lote, fecha, FK: id_enfermedad, diagnóstico, gravedad, observaciones, FK: id_veterinario (quien registra).</w:t>
-      </w:r>
-    </w:p>
-    <w:p>
-      <w:pPr>
-        <w:rPr/>
-      </w:pPr>
-      <w:r>
-        <w:rPr>
-          <w:rtl w:val="0"/>
-        </w:rPr>
-      </w:r>
-    </w:p>
-    <w:p>
-      <w:pPr>
-        <w:rPr/>
-      </w:pPr>
-      <w:r>
-        <w:rPr>
-          <w:rtl w:val="0"/>
-        </w:rPr>
-        <w:t xml:space="preserve">16.- Enfermedad: id_enfermedad, nombre, descripcion, sintomas.</w:t>
-      </w:r>
-    </w:p>
-    <w:p>
-      <w:pPr>
-        <w:rPr/>
-      </w:pPr>
-      <w:r>
-        <w:rPr>
-          <w:rtl w:val="0"/>
-        </w:rPr>
-      </w:r>
-    </w:p>
-    <w:p>
-      <w:pPr>
-        <w:rPr/>
-      </w:pPr>
-      <w:r>
-        <w:rPr>
-          <w:rtl w:val="0"/>
-        </w:rPr>
-        <w:t xml:space="preserve">17.- Tratamiento: id_tratamiento, FK: id_registro, FK: id_producto (medicamento), dosis, fecha_inicio, fecha_fin, FK: id_veterinario (responsable), estado.</w:t>
-      </w:r>
-    </w:p>
-    <w:p>
-      <w:pPr>
-        <w:rPr/>
-      </w:pPr>
-      <w:r>
-        <w:rPr>
-          <w:rtl w:val="0"/>
-        </w:rPr>
-      </w:r>
-    </w:p>
-    <w:p>
-      <w:pPr>
-        <w:rPr/>
-      </w:pPr>
-      <w:r>
-        <w:rPr>
-          <w:rtl w:val="0"/>
-        </w:rPr>
-        <w:t xml:space="preserve">18.- Trabajador: id_trabajador, nombre, apellido, rut (UNIQUE), cargo, teléfono, correo, estado, fecha_contrato, FK: id_centro.</w:t>
-      </w:r>
-    </w:p>
-    <w:p>
-      <w:pPr>
-        <w:rPr/>
-      </w:pPr>
-      <w:r>
-        <w:rPr>
-          <w:rtl w:val="0"/>
-        </w:rPr>
-      </w:r>
-    </w:p>
-    <w:p>
-      <w:pPr>
-        <w:rPr/>
-      </w:pPr>
-      <w:r>
-        <w:rPr>
-          <w:rtl w:val="0"/>
-        </w:rPr>
-        <w:t xml:space="preserve">19.- Veterinario: id_veterinario, nombre, apellido, rut (UNIQUE), registro_profesional, email, telefono, tipo_contrato, especialidad, firma_digital, estado (activo, inactivo, licencia), fecha_contrato.</w:t>
-      </w:r>
-    </w:p>
-    <w:p>
-      <w:pPr>
-        <w:rPr/>
-      </w:pPr>
-      <w:r>
-        <w:rPr>
-          <w:rtl w:val="0"/>
-        </w:rPr>
-      </w:r>
-    </w:p>
-    <w:p>
-      <w:pPr>
-        <w:rPr/>
-      </w:pPr>
-      <w:r>
-        <w:rPr>
-          <w:rtl w:val="0"/>
-        </w:rPr>
-        <w:t xml:space="preserve">20.- Veterinario_Centro: FK: id_veterinario, FK: id_centro, fecha_inicio, fecha_fin (un veterinario puede atender varios centros).</w:t>
-      </w:r>
-    </w:p>
-    <w:p>
-      <w:pPr>
-        <w:rPr/>
-      </w:pPr>
-      <w:r>
-        <w:rPr>
-          <w:rtl w:val="0"/>
-        </w:rPr>
-      </w:r>
-    </w:p>
-    <w:p>
-      <w:pPr>
-        <w:rPr/>
-      </w:pPr>
-      <w:r>
-        <w:rPr>
-          <w:rtl w:val="0"/>
-        </w:rPr>
-        <w:t xml:space="preserve">21.- Embarcación: id_embarcacion, nombre, matrícula (UNIQUE), tipo, capacidad, estado, FK: id_centro (o id_empresa, según quién sea el dueño).</w:t>
-      </w:r>
-    </w:p>
-    <w:p>
-      <w:pPr>
-        <w:rPr/>
-      </w:pPr>
-      <w:r>
-        <w:rPr>
-          <w:rtl w:val="0"/>
-        </w:rPr>
-      </w:r>
-    </w:p>
-    <w:p>
-      <w:pPr>
-        <w:rPr/>
-      </w:pPr>
-      <w:r>
-        <w:rPr>
-          <w:rtl w:val="0"/>
-        </w:rPr>
-        <w:t xml:space="preserve">22.- Traslado: id_traslado, FK: id_lote, FK: id_centro (centro origen), FK: id_centro (centro destino), fecha_salida, fecha_llegada, cantidad_trasladada, FK: id_embarcacion, FK: id_trabajador (responsable), estado (pendiente, en tránsito, completado).</w:t>
-      </w:r>
-    </w:p>
-    <w:p>
-      <w:pPr>
-        <w:rPr/>
-      </w:pPr>
-      <w:r>
-        <w:rPr>
-          <w:rtl w:val="0"/>
-        </w:rPr>
-      </w:r>
-    </w:p>
-    <w:p>
-      <w:pPr>
-        <w:rPr/>
-      </w:pPr>
-      <w:r>
-        <w:rPr>
-          <w:rtl w:val="0"/>
-        </w:rPr>
-        <w:t xml:space="preserve">23.- Producción / Cosecha: id_produccion, FK: id_lote, fecha, cantidad_peces, peso_total_kg, destino (venta, consumo interno, descarte), observaciones, FK: id_trabajador (responsable).</w:t>
-      </w:r>
-    </w:p>
-    <w:p>
-      <w:pPr>
-        <w:rPr/>
-      </w:pPr>
-      <w:r>
-        <w:rPr>
-          <w:rtl w:val="0"/>
-        </w:rPr>
-      </w:r>
-    </w:p>
-    <w:p>
-      <w:pPr>
-        <w:rPr/>
-      </w:pPr>
-      <w:r>
-        <w:rPr>
-          <w:rtl w:val="0"/>
-        </w:rPr>
-        <w:t xml:space="preserve">24.- Proveedor: id_proveedor, nombre, rut (UNIQUE), dirección, teléfono, correo, tipo_proveedor (alimento, medicamentos, equipamiento).</w:t>
-      </w:r>
-    </w:p>
-    <w:p>
-      <w:pPr>
-        <w:rPr/>
-      </w:pPr>
-      <w:r>
-        <w:rPr>
-          <w:rtl w:val="0"/>
-        </w:rPr>
-      </w:r>
-    </w:p>
-    <w:p>
-      <w:pPr>
-        <w:rPr/>
-      </w:pPr>
-      <w:r>
-        <w:rPr>
-          <w:rtl w:val="0"/>
-        </w:rPr>
-        <w:t xml:space="preserve">25.- Producto: id_producto, nombre, tipo (alimento, medicamento, equipamiento), unidad_medida, precio, stock.</w:t>
-      </w:r>
-    </w:p>
-    <w:p>
-      <w:pPr>
-        <w:rPr/>
-      </w:pPr>
-      <w:r>
-        <w:rPr>
-          <w:rtl w:val="0"/>
-        </w:rPr>
-        <w:t xml:space="preserve">26.- Compra (Orden de compra): id_compra, FK: id_proveedor, FK: id_centro (centro al que llega), fecha, total (debe coincidir con la suma del detalle), estado (pendiente, aprobada, recibida, cancelada), FK: id_trabajador (quien autoriza).</w:t>
-      </w:r>
-    </w:p>
-    <w:p>
-      <w:pPr>
-        <w:rPr/>
-      </w:pPr>
-      <w:r>
-        <w:rPr>
-          <w:rtl w:val="0"/>
-        </w:rPr>
-      </w:r>
-    </w:p>
-    <w:p>
-      <w:pPr>
-        <w:rPr/>
-      </w:pPr>
-      <w:r>
-        <w:rPr>
-          <w:rtl w:val="0"/>
-        </w:rPr>
-        <w:t xml:space="preserve">27.- Detalle_Compra: id_detalle, FK: id_compra, FK: id_producto, cantidad, precio_unitario.</w:t>
-      </w:r>
-    </w:p>
-    <w:p>
-      <w:pPr>
-        <w:rPr/>
-      </w:pPr>
-      <w:r>
-        <w:rPr>
-          <w:rtl w:val="0"/>
-        </w:rPr>
-      </w:r>
-    </w:p>
-    <w:p>
-      <w:pPr>
-        <w:rPr/>
-      </w:pPr>
-      <w:r>
-        <w:rPr>
-          <w:rtl w:val="0"/>
-        </w:rPr>
-        <w:t xml:space="preserve">28.- Recepción: id_recepcion, FK: id_compra, fecha_recepcion, FK: id_trabajador (recibido por), estado (completa, parcial, rechazada), observaciones.</w:t>
-      </w:r>
-    </w:p>
-    <w:p>
-      <w:pPr>
-        <w:rPr/>
-      </w:pPr>
-      <w:r>
-        <w:rPr>
-          <w:rtl w:val="0"/>
-        </w:rPr>
-      </w:r>
-    </w:p>
-    <w:p>
-      <w:pPr>
-        <w:rPr/>
-      </w:pPr>
-      <w:r>
-        <w:rPr>
-          <w:rtl w:val="0"/>
-        </w:rPr>
-        <w:t xml:space="preserve">29.- Equipamiento: id_equipamiento, nombre, FK: id_tipo_equipamiento, marca, modelo, estado, fecha_adquisicion, cantidad, FK: id_centro.</w:t>
-      </w:r>
-    </w:p>
-    <w:p>
-      <w:pPr>
-        <w:rPr/>
-      </w:pPr>
-      <w:r>
-        <w:rPr>
-          <w:rtl w:val="0"/>
-        </w:rPr>
-      </w:r>
-    </w:p>
-    <w:p>
-      <w:pPr>
-        <w:rPr/>
-      </w:pPr>
-      <w:r>
-        <w:rPr>
-          <w:rtl w:val="0"/>
-        </w:rPr>
-        <w:t xml:space="preserve">30.- Tipo_Equipamiento: id_tipo_equipamiento, nombre_tipo (estructura, robótica, alimentación, monitoreo, oxigenación, seguridad, mantención).</w:t>
-      </w:r>
-    </w:p>
-    <w:p>
-      <w:pPr>
-        <w:rPr/>
-      </w:pPr>
-      <w:r>
-        <w:rPr>
-          <w:rtl w:val="0"/>
-        </w:rPr>
-      </w:r>
-    </w:p>
-    <w:p>
-      <w:pPr>
-        <w:rPr/>
-      </w:pPr>
-      <w:r>
-        <w:rPr>
-          <w:rtl w:val="0"/>
-        </w:rPr>
-        <w:t xml:space="preserve">31.- Tarea / Actividad: id_tarea, FK: id_centro, FK: id_lote (nullable), descripcion, FK: id_trabajador (asignada a), fecha_asignada, fecha_limite, estado (pendiente, en progreso, completada), FK: id_trabajador (quien la registra).</w:t>
+        <w:t>9.- LOTE: ID_LOTE (PK), FECHA_INGRESO_LOTE, CANTIDAD_INICIAL_LOTE, CANTIDAD_ACTUAL_LOTE (calculada: inicial − mortalidad ± traslados − cosechas), ESTADO_LOTE, FK: ID_CENTRO, FK: ID_ESPECIE.</w:t>
+      </w:r>
+    </w:p>
+    <w:p>
+      <w:pPr>
+        <w:rPr/>
+      </w:pPr>
+      <w:r>
+        <w:rPr>
+          <w:rtl w:val="0"/>
+        </w:rPr>
+        <w:t>10.- MUESTREO / Biometría: ID_MUESTREO (PK), FECHA_MUES, PESO_PROMEDIO_MUES, CANTIDAD_MUESTRA_MUES, FK: ID_LOTE, FK: ID_TRABAJADOR (responsable).</w:t>
+      </w:r>
+    </w:p>
+    <w:p>
+      <w:pPr>
+        <w:rPr/>
+      </w:pPr>
+      <w:r>
+        <w:rPr>
+          <w:rtl w:val="0"/>
+        </w:rPr>
+      </w:r>
+    </w:p>
+    <w:p>
+      <w:pPr>
+        <w:rPr/>
+      </w:pPr>
+      <w:r>
+        <w:rPr>
+          <w:rtl w:val="0"/>
+        </w:rPr>
+        <w:t>11.- ALIMENTACION: ID_ALIMENTACION (PK), FECHA_ALIM, CANTIDAD_ALIM, FK: ID_LOTE, FK: ID_TIPO_ALIMENTO, FK: ID_TRABAJADOR (responsable).</w:t>
+      </w:r>
+    </w:p>
+    <w:p>
+      <w:pPr>
+        <w:rPr/>
+      </w:pPr>
+      <w:r>
+        <w:rPr>
+          <w:rtl w:val="0"/>
+        </w:rPr>
+      </w:r>
+    </w:p>
+    <w:p>
+      <w:pPr>
+        <w:rPr/>
+      </w:pPr>
+      <w:r>
+        <w:rPr>
+          <w:rtl w:val="0"/>
+        </w:rPr>
+        <w:t>12.- TIPO_ALIMENTO: ID_TIPO_ALIMENTO (PK), NOMBRE_TIPO_ALIM, DESCRIPCION_TIPO_ALIM.</w:t>
+      </w:r>
+    </w:p>
+    <w:p>
+      <w:pPr>
+        <w:rPr/>
+      </w:pPr>
+      <w:r>
+        <w:rPr>
+          <w:rtl w:val="0"/>
+        </w:rPr>
+      </w:r>
+    </w:p>
+    <w:p>
+      <w:pPr>
+        <w:rPr/>
+      </w:pPr>
+      <w:r>
+        <w:rPr>
+          <w:rtl w:val="0"/>
+        </w:rPr>
+        <w:t>13.- MORTALIDAD: ID_MORTALIDAD (PK), FECHA_MORT, CANTIDAD_MORT, OBSERVACIONES_MORT, FK: ID_LOTE, FK: ID_CAUSA, FK: ID_TRABAJADOR (quien registra).</w:t>
+      </w:r>
+    </w:p>
+    <w:p>
+      <w:pPr>
+        <w:rPr/>
+      </w:pPr>
+      <w:r>
+        <w:rPr>
+          <w:rtl w:val="0"/>
+        </w:rPr>
+      </w:r>
+    </w:p>
+    <w:p>
+      <w:pPr>
+        <w:rPr/>
+      </w:pPr>
+      <w:r>
+        <w:rPr>
+          <w:rtl w:val="0"/>
+        </w:rPr>
+        <w:t>14.- CAUSA_MORTALIDAD: ID_CAUSA (PK), NOMBRE_CAUSA, DESCRIPCION_CAUSA.</w:t>
+      </w:r>
+    </w:p>
+    <w:p>
+      <w:pPr>
+        <w:rPr/>
+      </w:pPr>
+      <w:r>
+        <w:rPr>
+          <w:rtl w:val="0"/>
+        </w:rPr>
+      </w:r>
+    </w:p>
+    <w:p>
+      <w:pPr>
+        <w:rPr/>
+      </w:pPr>
+      <w:r>
+        <w:rPr>
+          <w:rtl w:val="0"/>
+        </w:rPr>
+        <w:t>15.- REGISTRO_SANITARIO: ID_REGISTRO (PK), FECHA_REG_SANIT, DIAGNOSTICO_REG_SANIT, GRAVEDAD_REG_SANIT, OBSERVACIONES_REG_SANIT, FK: ID_LOTE, FK: ID_ENFERMEDAD, FK: ID_VETERINARIO (quien registra).</w:t>
+      </w:r>
+    </w:p>
+    <w:p>
+      <w:pPr>
+        <w:rPr/>
+      </w:pPr>
+      <w:r>
+        <w:rPr>
+          <w:rtl w:val="0"/>
+        </w:rPr>
+      </w:r>
+    </w:p>
+    <w:p>
+      <w:pPr>
+        <w:rPr/>
+      </w:pPr>
+      <w:r>
+        <w:rPr>
+          <w:rtl w:val="0"/>
+        </w:rPr>
+        <w:t>16.- ENFERMEDAD: ID_ENFERMEDAD (PK), NOMBRE_ENFERM, DESCRIPCION_ENFERM, SINTOMAS_ENFERM.</w:t>
+      </w:r>
+    </w:p>
+    <w:p>
+      <w:pPr>
+        <w:rPr/>
+      </w:pPr>
+      <w:r>
+        <w:rPr>
+          <w:rtl w:val="0"/>
+        </w:rPr>
+      </w:r>
+    </w:p>
+    <w:p>
+      <w:pPr>
+        <w:rPr/>
+      </w:pPr>
+      <w:r>
+        <w:rPr>
+          <w:rtl w:val="0"/>
+        </w:rPr>
+        <w:t>17.- TRATAMIENTO: ID_TRATAMIENTO (PK), DOSIS_TRAT, FECHA_INICIO_TRAT, FECHA_FIN_TRAT, ESTADO_TRAT, FK: ID_REGISTRO, FK: ID_PRODUCTO (medicamento), FK: ID_VETERINARIO (responsable).</w:t>
+      </w:r>
+    </w:p>
+    <w:p>
+      <w:pPr>
+        <w:rPr/>
+      </w:pPr>
+      <w:r>
+        <w:rPr>
+          <w:rtl w:val="0"/>
+        </w:rPr>
+      </w:r>
+    </w:p>
+    <w:p>
+      <w:pPr>
+        <w:rPr/>
+      </w:pPr>
+      <w:r>
+        <w:rPr>
+          <w:rtl w:val="0"/>
+        </w:rPr>
+        <w:t>18.- TRABAJADOR: ID_TRABAJADOR (PK), NOMBRE_TRAB, APELLIDO_TRAB, RUT_TRAB (UNIQUE), CARGO_TRAB, TELEFONO_TRAB, EMAIL_TRAB, ESTADO_TRAB, FECHA_CONTRATO_TRAB, FK: ID_CENTRO.</w:t>
+      </w:r>
+    </w:p>
+    <w:p>
+      <w:pPr>
+        <w:rPr/>
+      </w:pPr>
+      <w:r>
+        <w:rPr>
+          <w:rtl w:val="0"/>
+        </w:rPr>
+      </w:r>
+    </w:p>
+    <w:p>
+      <w:pPr>
+        <w:rPr/>
+      </w:pPr>
+      <w:r>
+        <w:rPr>
+          <w:rtl w:val="0"/>
+        </w:rPr>
+        <w:t>19.- VETERINARIO: ID_VETERINARIO (PK), RUT_VET (UNIQUE), REGISTRO_PROFESIONAL_VET, NOMBRE_VET, APELLIDO_VET, EMAIL_VET, TELEFONO_VET, TIPO_CONTRATO_VET, ESPECIALIDAD_VET, FIRMA_DIGITAL_VET (BLOB), ESTADO_VET (activo, inactivo, licencia), FECHA_CONTRATO_VET.</w:t>
+      </w:r>
+    </w:p>
+    <w:p>
+      <w:pPr>
+        <w:rPr/>
+      </w:pPr>
+      <w:r>
+        <w:rPr>
+          <w:rtl w:val="0"/>
+        </w:rPr>
+      </w:r>
+    </w:p>
+    <w:p>
+      <w:pPr>
+        <w:rPr/>
+      </w:pPr>
+      <w:r>
+        <w:rPr>
+          <w:rtl w:val="0"/>
+        </w:rPr>
+        <w:t>20.- VETERINARIO_CENTRO: FK: ID_VETERINARIO, FK: ID_CENTRO (PK compuesta), FECHA_INICIO_VET_CENTRO, FECHA_FIN_VET_CENTRO (un veterinario puede atender varios centros).</w:t>
+      </w:r>
+    </w:p>
+    <w:p>
+      <w:pPr>
+        <w:rPr/>
+      </w:pPr>
+      <w:r>
+        <w:rPr>
+          <w:rtl w:val="0"/>
+        </w:rPr>
+      </w:r>
+    </w:p>
+    <w:p>
+      <w:pPr>
+        <w:rPr/>
+      </w:pPr>
+      <w:r>
+        <w:rPr>
+          <w:rtl w:val="0"/>
+        </w:rPr>
+        <w:t>21.- EMBARCACION: ID_EMBARCACION (PK), NOMBRE_EMB, MATRICULA_EMB (UNIQUE), TIPO_EMB, CAPACIDAD_EMB, ESTADO_EMB, FK: ID_CENTRO.</w:t>
+      </w:r>
+    </w:p>
+    <w:p>
+      <w:pPr>
+        <w:rPr/>
+      </w:pPr>
+      <w:r>
+        <w:rPr>
+          <w:rtl w:val="0"/>
+        </w:rPr>
+      </w:r>
+    </w:p>
+    <w:p>
+      <w:pPr>
+        <w:rPr/>
+      </w:pPr>
+      <w:r>
+        <w:rPr>
+          <w:rtl w:val="0"/>
+        </w:rPr>
+        <w:t>22.- TRASLADO: ID_TRASLADO (PK), FECHA_SALIDA_TRAS, FECHA_LLEGADA_TRAS, CANTIDAD_TRAS, ESTADO_TRAS (pendiente, en tránsito, completado), FK: ID_LOTE, FK: ID_CENTRO_ORIGEN, FK: ID_CENTRO_DESTINO, FK: ID_EMBARCACION, FK: ID_TRABAJADOR (responsable).</w:t>
+      </w:r>
+    </w:p>
+    <w:p>
+      <w:pPr>
+        <w:rPr/>
+      </w:pPr>
+      <w:r>
+        <w:rPr>
+          <w:rtl w:val="0"/>
+        </w:rPr>
+      </w:r>
+    </w:p>
+    <w:p>
+      <w:pPr>
+        <w:rPr/>
+      </w:pPr>
+      <w:r>
+        <w:rPr>
+          <w:rtl w:val="0"/>
+        </w:rPr>
+        <w:t>23.- PRODUCCION / Cosecha: ID_PRODUCCION (PK), FECHA_PRODUC, CANTIDAD_PECES_PRODUC, PESO_TOTAL_KG_PRODUC, DESTINO_PRODUC (venta, consumo interno, descarte), OBSERVACIONES_PRODUC, FK: ID_LOTE, FK: ID_TRABAJADOR (responsable).</w:t>
+      </w:r>
+    </w:p>
+    <w:p>
+      <w:pPr>
+        <w:rPr/>
+      </w:pPr>
+      <w:r>
+        <w:rPr>
+          <w:rtl w:val="0"/>
+        </w:rPr>
+      </w:r>
+    </w:p>
+    <w:p>
+      <w:pPr>
+        <w:rPr/>
+      </w:pPr>
+      <w:r>
+        <w:rPr>
+          <w:rtl w:val="0"/>
+        </w:rPr>
+        <w:t>24.- PROVEEDOR: ID_PROVEEDOR (PK), NOMBRE_PROV, RUT_PROV (UNIQUE), DIRECCION_PROV, TELEFONO_PROV, EMAIL_PROV, TIPO_PROV (alimento, medicamentos, equipamiento).</w:t>
+      </w:r>
+    </w:p>
+    <w:p>
+      <w:pPr>
+        <w:rPr/>
+      </w:pPr>
+      <w:r>
+        <w:rPr>
+          <w:rtl w:val="0"/>
+        </w:rPr>
+      </w:r>
+    </w:p>
+    <w:p>
+      <w:pPr>
+        <w:rPr/>
+      </w:pPr>
+      <w:r>
+        <w:rPr>
+          <w:rtl w:val="0"/>
+        </w:rPr>
+        <w:t>25.- PRODUCTO: ID_PRODUCTO (PK), NOMBRE_PROD, TIPO_PROD (alimento, medicamento, equipamiento), UNIDAD_MEDIDA_PROD, PRECIO_PROD, STOCK_PROD.</w:t>
+      </w:r>
+    </w:p>
+    <w:p>
+      <w:pPr>
+        <w:rPr/>
+      </w:pPr>
+      <w:r>
+        <w:rPr>
+          <w:rtl w:val="0"/>
+        </w:rPr>
+        <w:t>26.- COMPRA (Orden de compra): ID_COMPRA (PK), FECHA_COMPRA, TOTAL_COMPRA (debe coincidir con la suma del detalle), ESTADO_COMPRA (pendiente, aprobada, recibida, cancelada), FK: ID_PROVEEDOR, FK: ID_CENTRO (centro al que llega), FK: ID_TRABAJADOR (quien autoriza).</w:t>
+      </w:r>
+    </w:p>
+    <w:p>
+      <w:pPr>
+        <w:rPr/>
+      </w:pPr>
+      <w:r>
+        <w:rPr>
+          <w:rtl w:val="0"/>
+        </w:rPr>
+      </w:r>
+    </w:p>
+    <w:p>
+      <w:pPr>
+        <w:rPr/>
+      </w:pPr>
+      <w:r>
+        <w:rPr>
+          <w:rtl w:val="0"/>
+        </w:rPr>
+        <w:t>27.- DETALLE_COMPRA: ID_DETALLE (PK), CANTIDAD_DET_COMPRA, PRECIO_UNITARIO_DET_COMPRA, FK: ID_COMPRA, FK: ID_PRODUCTO.</w:t>
+      </w:r>
+    </w:p>
+    <w:p>
+      <w:pPr>
+        <w:rPr/>
+      </w:pPr>
+      <w:r>
+        <w:rPr>
+          <w:rtl w:val="0"/>
+        </w:rPr>
+      </w:r>
+    </w:p>
+    <w:p>
+      <w:pPr>
+        <w:rPr/>
+      </w:pPr>
+      <w:r>
+        <w:rPr>
+          <w:rtl w:val="0"/>
+        </w:rPr>
+        <w:t>28.- RECEPCION: ID_RECEPCION (PK), FECHA_RECEP, ESTADO_RECEP (completa, parcial, rechazada), OBSERVACIONES_RECEP, FK: ID_COMPRA, FK: ID_TRABAJADOR (recibido por).</w:t>
+      </w:r>
+    </w:p>
+    <w:p>
+      <w:pPr>
+        <w:rPr/>
+      </w:pPr>
+      <w:r>
+        <w:rPr>
+          <w:rtl w:val="0"/>
+        </w:rPr>
+      </w:r>
+    </w:p>
+    <w:p>
+      <w:pPr>
+        <w:rPr/>
+      </w:pPr>
+      <w:r>
+        <w:rPr>
+          <w:rtl w:val="0"/>
+        </w:rPr>
+        <w:t>29.- EQUIPAMIENTO: ID_EQUIPAMIENTO (PK), NOMBRE_EQUIP, MARCA_EQUIP, MODELO_EQUIP, ESTADO_EQUIP, FECHA_ADQUISICION_EQUIP, CANTIDAD_EQUIP, FK: ID_TIPO_EQUIPAMIENTO, FK: ID_CENTRO.</w:t>
+      </w:r>
+    </w:p>
+    <w:p>
+      <w:pPr>
+        <w:rPr/>
+      </w:pPr>
+      <w:r>
+        <w:rPr>
+          <w:rtl w:val="0"/>
+        </w:rPr>
+      </w:r>
+    </w:p>
+    <w:p>
+      <w:pPr>
+        <w:rPr/>
+      </w:pPr>
+      <w:r>
+        <w:rPr>
+          <w:rtl w:val="0"/>
+        </w:rPr>
+        <w:t>30.- TIPO_EQUIPAMIENTO: ID_TIPO_EQUIPAMIENTO (PK), NOMBRE_TIPO_EQUIP (estructura, robótica, alimentación, monitoreo, oxigenación, seguridad, mantención).</w:t>
+      </w:r>
+    </w:p>
+    <w:p>
+      <w:pPr>
+        <w:rPr/>
+      </w:pPr>
+      <w:r>
+        <w:rPr>
+          <w:rtl w:val="0"/>
+        </w:rPr>
+      </w:r>
+    </w:p>
+    <w:p>
+      <w:pPr>
+        <w:rPr/>
+      </w:pPr>
+      <w:r>
+        <w:rPr>
+          <w:rtl w:val="0"/>
+        </w:rPr>
+        <w:t>31.- TAREA / Actividad: ID_TAREA (PK), DESCRIPCION_TAREA, FECHA_ASIGNADA_TAREA, FECHA_LIMITE_TAREA, ESTADO_TAREA (pendiente, en progreso, completada), FK: ID_CENTRO, FK: ID_LOTE (nullable), FK: ID_TRABAJADOR_ASIGNADO (asignada a), FK: ID_TRABAJADOR_REGISTRA (quien la registra).</w:t>
       </w:r>
     </w:p>
     <w:p>

</xml_diff>